<commit_message>
#255 – updated RR and excess cases calculation, unit test revisions
</commit_message>
<xml_diff>
--- a/documents/VersionHistory.docx
+++ b/documents/VersionHistory.docx
@@ -1,6 +1,6 @@
 
 <file path=word/document.xml><?xml version="1.0" encoding="utf-8"?>
-<w:document xmlns:wpc="http://schemas.microsoft.com/office/word/2010/wordprocessingCanvas" xmlns:cx="http://schemas.microsoft.com/office/drawing/2014/chartex" xmlns:cx1="http://schemas.microsoft.com/office/drawing/2015/9/8/chartex" xmlns:cx2="http://schemas.microsoft.com/office/drawing/2015/10/21/chartex" xmlns:cx3="http://schemas.microsoft.com/office/drawing/2016/5/9/chartex" xmlns:cx4="http://schemas.microsoft.com/office/drawing/2016/5/10/chartex" xmlns:cx5="http://schemas.microsoft.com/office/drawing/2016/5/11/chartex" xmlns:cx6="http://schemas.microsoft.com/office/drawing/2016/5/12/chartex" xmlns:cx7="http://schemas.microsoft.com/office/drawing/2016/5/13/chartex" xmlns:cx8="http://schemas.microsoft.com/office/drawing/2016/5/14/chartex" xmlns:mc="http://schemas.openxmlformats.org/markup-compatibility/2006" xmlns:aink="http://schemas.microsoft.com/office/drawing/2016/ink" xmlns:am3d="http://schemas.microsoft.com/office/drawing/2017/model3d" xmlns:o="urn:schemas-microsoft-com:office:office" xmlns:oel="http://schemas.microsoft.com/office/2019/extlst" xmlns:r="http://schemas.openxmlformats.org/officeDocument/2006/relationships" xmlns:m="http://schemas.openxmlformats.org/officeDocument/2006/math" xmlns:v="urn:schemas-microsoft-com:vml" xmlns:wp14="http://schemas.microsoft.com/office/word/2010/wordprocessingDrawing" xmlns:wp="http://schemas.openxmlformats.org/drawingml/2006/wordprocessingDrawing" xmlns:w10="urn:schemas-microsoft-com:office:word" xmlns:w="http://schemas.openxmlformats.org/wordprocessingml/2006/main" xmlns:w14="http://schemas.microsoft.com/office/word/2010/wordml" xmlns:w15="http://schemas.microsoft.com/office/word/2012/wordml" xmlns:w16cex="http://schemas.microsoft.com/office/word/2018/wordml/cex" xmlns:w16cid="http://schemas.microsoft.com/office/word/2016/wordml/cid" xmlns:w16="http://schemas.microsoft.com/office/word/2018/wordml" xmlns:w16du="http://schemas.microsoft.com/office/word/2023/wordml/word16du" xmlns:w16sdtdh="http://schemas.microsoft.com/office/word/2020/wordml/sdtdatahash" xmlns:w16sdtfl="http://schemas.microsoft.com/office/word/2024/wordml/sdtformatlock" xmlns:w16se="http://schemas.microsoft.com/office/word/2015/wordml/symex" xmlns:wpg="http://schemas.microsoft.com/office/word/2010/wordprocessingGroup" xmlns:wpi="http://schemas.microsoft.com/office/word/2010/wordprocessingInk" xmlns:wne="http://schemas.microsoft.com/office/word/2006/wordml" xmlns:wps="http://schemas.microsoft.com/office/word/2010/wordprocessingShape" mc:Ignorable="w14 w15 w16se w16cid w16 w16cex w16sdtdh w16sdtfl w16du wp14">
+<w:document xmlns:wpc="http://schemas.microsoft.com/office/word/2010/wordprocessingCanvas" xmlns:cx="http://schemas.microsoft.com/office/drawing/2014/chartex" xmlns:cx1="http://schemas.microsoft.com/office/drawing/2015/9/8/chartex" xmlns:cx2="http://schemas.microsoft.com/office/drawing/2015/10/21/chartex" xmlns:cx3="http://schemas.microsoft.com/office/drawing/2016/5/9/chartex" xmlns:cx4="http://schemas.microsoft.com/office/drawing/2016/5/10/chartex" xmlns:cx5="http://schemas.microsoft.com/office/drawing/2016/5/11/chartex" xmlns:cx6="http://schemas.microsoft.com/office/drawing/2016/5/12/chartex" xmlns:cx7="http://schemas.microsoft.com/office/drawing/2016/5/13/chartex" xmlns:cx8="http://schemas.microsoft.com/office/drawing/2016/5/14/chartex" xmlns:mc="http://schemas.openxmlformats.org/markup-compatibility/2006" xmlns:aink="http://schemas.microsoft.com/office/drawing/2016/ink" xmlns:am3d="http://schemas.microsoft.com/office/drawing/2017/model3d" xmlns:o="urn:schemas-microsoft-com:office:office" xmlns:oel="http://schemas.microsoft.com/office/2019/extlst" xmlns:r="http://schemas.openxmlformats.org/officeDocument/2006/relationships" xmlns:m="http://schemas.openxmlformats.org/officeDocument/2006/math" xmlns:v="urn:schemas-microsoft-com:vml" xmlns:wp14="http://schemas.microsoft.com/office/word/2010/wordprocessingDrawing" xmlns:wp="http://schemas.openxmlformats.org/drawingml/2006/wordprocessingDrawing" xmlns:w10="urn:schemas-microsoft-com:office:word" xmlns:w="http://schemas.openxmlformats.org/wordprocessingml/2006/main" xmlns:w14="http://schemas.microsoft.com/office/word/2010/wordml" xmlns:w15="http://schemas.microsoft.com/office/word/2012/wordml" xmlns:w16cei="http://schemas.microsoft.com/office/word/2026/wordml/cei" xmlns:w16cex="http://schemas.microsoft.com/office/word/2018/wordml/cex" xmlns:w16cid="http://schemas.microsoft.com/office/word/2016/wordml/cid" xmlns:w16="http://schemas.microsoft.com/office/word/2018/wordml" xmlns:w16du="http://schemas.microsoft.com/office/word/2023/wordml/word16du" xmlns:w16sdtdh="http://schemas.microsoft.com/office/word/2020/wordml/sdtdatahash" xmlns:w16sdtfl="http://schemas.microsoft.com/office/word/2024/wordml/sdtformatlock" xmlns:w16se="http://schemas.microsoft.com/office/word/2015/wordml/symex" xmlns:wpg="http://schemas.microsoft.com/office/word/2010/wordprocessingGroup" xmlns:wpi="http://schemas.microsoft.com/office/word/2010/wordprocessingInk" xmlns:wne="http://schemas.microsoft.com/office/word/2006/wordml" xmlns:wps="http://schemas.microsoft.com/office/word/2010/wordprocessingShape" mc:Ignorable="w14 w15 w16se w16cid w16 w16cex w16sdtdh w16sdtfl w16du wp14">
   <w:body>
     <w:p>
       <w:pPr>
@@ -773,6 +773,132 @@
         <w:rPr>
           <w:b/>
         </w:rPr>
+        <w:t>.1</w:t>
+      </w:r>
+      <w:r>
+        <w:rPr>
+          <w:b/>
+        </w:rPr>
+        <w:t xml:space="preserve">, </w:t>
+      </w:r>
+      <w:r>
+        <w:rPr>
+          <w:b/>
+        </w:rPr>
+        <w:t>August</w:t>
+      </w:r>
+      <w:r>
+        <w:rPr>
+          <w:b/>
+        </w:rPr>
+        <w:t xml:space="preserve"> 20</w:t>
+      </w:r>
+      <w:r>
+        <w:rPr>
+          <w:b/>
+        </w:rPr>
+        <w:t>26</w:t>
+      </w:r>
+    </w:p>
+    <w:p>
+      <w:pPr>
+        <w:ind w:left="360" w:hanging="360"/>
+        <w:jc w:val="both"/>
+        <w:rPr>
+          <w:i/>
+        </w:rPr>
+      </w:pPr>
+      <w:r>
+        <w:rPr>
+          <w:i/>
+        </w:rPr>
+        <w:t>Minor Fixes</w:t>
+      </w:r>
+    </w:p>
+    <w:p>
+      <w:pPr>
+        <w:pStyle w:val="BodyTextIndent2"/>
+        <w:jc w:val="both"/>
+      </w:pPr>
+      <w:r>
+        <w:t xml:space="preserve">Added an </w:t>
+      </w:r>
+      <w:r>
+        <w:t xml:space="preserve">alternative </w:t>
+      </w:r>
+      <w:r>
+        <w:t>option to skip evaluation of a tree node</w:t>
+      </w:r>
+      <w:r>
+        <w:t xml:space="preserve">. Now specific nodes in the tree can be marked as not evaluated </w:t>
+      </w:r>
+      <w:r>
+        <w:t>directly in the tree file</w:t>
+      </w:r>
+      <w:r>
+        <w:t>.</w:t>
+      </w:r>
+    </w:p>
+    <w:p>
+      <w:pPr>
+        <w:pStyle w:val="BodyTextIndent2"/>
+        <w:jc w:val="both"/>
+      </w:pPr>
+      <w:r>
+        <w:t>'Relative Risk' attribute renamed to 'Odds Ratio' for tree-time, conditioned on node and time</w:t>
+      </w:r>
+    </w:p>
+    <w:p>
+      <w:pPr>
+        <w:pStyle w:val="BodyTextIndent2"/>
+        <w:jc w:val="both"/>
+      </w:pPr>
+      <w:r>
+        <w:t>Revised the formula for excess cases with tree-time, Conditioned on node and time.</w:t>
+      </w:r>
+    </w:p>
+    <w:p>
+      <w:pPr>
+        <w:pStyle w:val="BodyTextIndent2"/>
+        <w:jc w:val="both"/>
+      </w:pPr>
+      <w:r>
+        <w:t>Revised formula for Odds Ratio with tree-time, conditioned on node and time, adjusting for weekly trends nonparametrically.</w:t>
+      </w:r>
+    </w:p>
+    <w:p>
+      <w:pPr>
+        <w:ind w:left="360" w:hanging="360"/>
+        <w:jc w:val="both"/>
+        <w:rPr>
+          <w:b/>
+        </w:rPr>
+      </w:pPr>
+    </w:p>
+    <w:p>
+      <w:pPr>
+        <w:ind w:left="360" w:hanging="360"/>
+        <w:jc w:val="both"/>
+        <w:rPr>
+          <w:b/>
+        </w:rPr>
+      </w:pPr>
+      <w:r>
+        <w:rPr>
+          <w:b/>
+        </w:rPr>
+        <w:t xml:space="preserve">Version </w:t>
+      </w:r>
+      <w:r>
+        <w:rPr>
+          <w:b/>
+        </w:rPr>
+        <w:t>2.4</w:t>
+      </w:r>
+      <w:r>
+        <w:rPr>
+          <w:b/>
+        </w:rPr>
         <w:t xml:space="preserve">, </w:t>
       </w:r>
       <w:r>
@@ -996,6 +1122,7 @@
         <w:jc w:val="both"/>
       </w:pPr>
       <w:r>
+        <w:lastRenderedPageBreak/>
         <w:t xml:space="preserve">Updated compilation to the </w:t>
       </w:r>
       <w:r>
@@ -1181,7 +1308,6 @@
           <w:color w:val="333333"/>
           <w:shd w:val="clear" w:color="auto" w:fill="FFFFFF"/>
         </w:rPr>
-        <w:lastRenderedPageBreak/>
         <w:t>Correct</w:t>
       </w:r>
       <w:r>
@@ -1736,6 +1862,7 @@
         <w:rPr>
           <w:i/>
         </w:rPr>
+        <w:lastRenderedPageBreak/>
         <w:t>New Analytical Features</w:t>
       </w:r>
     </w:p>
@@ -1952,7 +2079,6 @@
         <w:jc w:val="both"/>
       </w:pPr>
       <w:r>
-        <w:lastRenderedPageBreak/>
         <w:t xml:space="preserve">Added non-analytical option </w:t>
       </w:r>
       <w:r>
@@ -2762,6 +2888,7 @@
         <w:jc w:val="both"/>
       </w:pPr>
       <w:r>
+        <w:lastRenderedPageBreak/>
         <w:t>Added ‘Parent Node’ column to results files.</w:t>
       </w:r>
     </w:p>
@@ -2864,14 +2991,981 @@
         <w:rPr>
           <w:b/>
         </w:rPr>
+        <w:t>Version 1.</w:t>
+      </w:r>
+      <w:r>
+        <w:rPr>
+          <w:b/>
+        </w:rPr>
+        <w:t>4</w:t>
+      </w:r>
+      <w:r>
+        <w:rPr>
+          <w:b/>
+        </w:rPr>
+        <w:t xml:space="preserve">, </w:t>
+      </w:r>
+      <w:r>
+        <w:rPr>
+          <w:b/>
+        </w:rPr>
+        <w:t>June</w:t>
+      </w:r>
+      <w:r>
+        <w:rPr>
+          <w:b/>
+        </w:rPr>
+        <w:t xml:space="preserve"> 20</w:t>
+      </w:r>
+      <w:r>
+        <w:rPr>
+          <w:b/>
+        </w:rPr>
+        <w:t>18</w:t>
+      </w:r>
+    </w:p>
+    <w:p>
+      <w:pPr>
+        <w:jc w:val="both"/>
+        <w:rPr>
+          <w:i/>
+        </w:rPr>
+      </w:pPr>
+      <w:r>
+        <w:rPr>
+          <w:i/>
+        </w:rPr>
+        <w:t>New Analytical Features</w:t>
+      </w:r>
+    </w:p>
+    <w:p>
+      <w:pPr>
+        <w:pStyle w:val="BodyTextIndent2"/>
+        <w:jc w:val="both"/>
+        <w:rPr>
+          <w:bCs/>
+        </w:rPr>
+      </w:pPr>
+      <w:r>
+        <w:rPr>
+          <w:bCs/>
+        </w:rPr>
+        <w:t>Differential follow-up time</w:t>
+      </w:r>
+      <w:r>
+        <w:rPr>
+          <w:bCs/>
+        </w:rPr>
+        <w:t xml:space="preserve"> with temporal scan statistic</w:t>
+      </w:r>
+      <w:r>
+        <w:rPr>
+          <w:bCs/>
+        </w:rPr>
+        <w:t>s</w:t>
+      </w:r>
+      <w:r>
+        <w:rPr>
+          <w:bCs/>
+        </w:rPr>
+        <w:t>.</w:t>
+      </w:r>
+    </w:p>
+    <w:p>
+      <w:pPr>
+        <w:pStyle w:val="BodyTextIndent2"/>
+        <w:jc w:val="both"/>
+        <w:rPr>
+          <w:bCs/>
+        </w:rPr>
+      </w:pPr>
+      <w:r>
+        <w:rPr>
+          <w:bCs/>
+        </w:rPr>
+        <w:t>M</w:t>
+      </w:r>
+      <w:r>
+        <w:rPr>
+          <w:bCs/>
+        </w:rPr>
+        <w:t>ultiple ranges in the data time range</w:t>
+      </w:r>
+      <w:r>
+        <w:rPr>
+          <w:bCs/>
+        </w:rPr>
+        <w:t>.</w:t>
+      </w:r>
+    </w:p>
+    <w:p>
+      <w:pPr>
+        <w:pStyle w:val="BodyTextIndent2"/>
+        <w:jc w:val="both"/>
+        <w:rPr>
+          <w:bCs/>
+        </w:rPr>
+      </w:pPr>
+      <w:r>
+        <w:rPr>
+          <w:bCs/>
+        </w:rPr>
+        <w:t>S</w:t>
+      </w:r>
+      <w:r>
+        <w:rPr>
+          <w:bCs/>
+        </w:rPr>
+        <w:t>canning risk window parameters</w:t>
+      </w:r>
+      <w:r>
+        <w:rPr>
+          <w:bCs/>
+        </w:rPr>
+        <w:t>.</w:t>
+      </w:r>
+    </w:p>
+    <w:p>
+      <w:pPr>
+        <w:pStyle w:val="BodyTextIndent2"/>
+        <w:jc w:val="both"/>
+        <w:rPr>
+          <w:bCs/>
+        </w:rPr>
+      </w:pPr>
+      <w:r>
+        <w:rPr>
+          <w:bCs/>
+        </w:rPr>
+        <w:t>Tree visualization in html output file.</w:t>
+      </w:r>
+    </w:p>
+    <w:p>
+      <w:pPr>
+        <w:pStyle w:val="BodyTextIndent2"/>
+        <w:jc w:val="both"/>
+        <w:rPr>
+          <w:bCs/>
+        </w:rPr>
+      </w:pPr>
+    </w:p>
+    <w:p>
+      <w:pPr>
+        <w:ind w:left="360" w:hanging="360"/>
+        <w:jc w:val="both"/>
+        <w:rPr>
+          <w:i/>
+        </w:rPr>
+      </w:pPr>
+      <w:r>
+        <w:rPr>
+          <w:i/>
+        </w:rPr>
+        <w:t>Minor Fixes</w:t>
+      </w:r>
+    </w:p>
+    <w:p>
+      <w:pPr>
+        <w:ind w:left="360" w:hanging="360"/>
+        <w:jc w:val="both"/>
+        <w:rPr>
+          <w:color w:val="212121"/>
+        </w:rPr>
+      </w:pPr>
+      <w:r>
+        <w:rPr>
+          <w:color w:val="212121"/>
+        </w:rPr>
+        <w:t>Mac version updated to work with Oracle Java 9.</w:t>
+      </w:r>
+    </w:p>
+    <w:p>
+      <w:pPr>
+        <w:ind w:left="360" w:hanging="360"/>
+        <w:jc w:val="both"/>
+        <w:rPr>
+          <w:b/>
+        </w:rPr>
+      </w:pPr>
+    </w:p>
+    <w:p>
+      <w:pPr>
+        <w:ind w:left="360" w:hanging="360"/>
+        <w:jc w:val="both"/>
+        <w:rPr>
+          <w:b/>
+        </w:rPr>
+      </w:pPr>
+      <w:r>
+        <w:rPr>
+          <w:b/>
+        </w:rPr>
+        <w:t>Version 1.</w:t>
+      </w:r>
+      <w:r>
+        <w:rPr>
+          <w:b/>
+        </w:rPr>
+        <w:t>3</w:t>
+      </w:r>
+      <w:r>
+        <w:rPr>
+          <w:b/>
+        </w:rPr>
+        <w:t xml:space="preserve">, </w:t>
+      </w:r>
+      <w:r>
+        <w:rPr>
+          <w:b/>
+        </w:rPr>
+        <w:t>August</w:t>
+      </w:r>
+      <w:r>
+        <w:rPr>
+          <w:b/>
+        </w:rPr>
+        <w:t xml:space="preserve"> 20</w:t>
+      </w:r>
+      <w:r>
+        <w:rPr>
+          <w:b/>
+        </w:rPr>
+        <w:t>16</w:t>
+      </w:r>
+    </w:p>
+    <w:p>
+      <w:pPr>
+        <w:jc w:val="both"/>
+        <w:rPr>
+          <w:i/>
+        </w:rPr>
+      </w:pPr>
+      <w:r>
+        <w:rPr>
+          <w:i/>
+        </w:rPr>
+        <w:t>New Analytical Features</w:t>
+      </w:r>
+    </w:p>
+    <w:p>
+      <w:pPr>
+        <w:pStyle w:val="BodyTextIndent2"/>
+        <w:jc w:val="both"/>
+        <w:rPr>
+          <w:bCs/>
+        </w:rPr>
+      </w:pPr>
+      <w:r>
+        <w:rPr>
+          <w:bCs/>
+        </w:rPr>
+        <w:t>Scan multiple trees</w:t>
+      </w:r>
+      <w:r>
+        <w:rPr>
+          <w:bCs/>
+        </w:rPr>
+        <w:t xml:space="preserve"> simultaneously</w:t>
+      </w:r>
+      <w:r>
+        <w:rPr>
+          <w:bCs/>
+        </w:rPr>
+        <w:t>.</w:t>
+      </w:r>
+    </w:p>
+    <w:p>
+      <w:pPr>
+        <w:pStyle w:val="BodyTextIndent2"/>
+        <w:jc w:val="both"/>
+        <w:rPr>
+          <w:bCs/>
+        </w:rPr>
+      </w:pPr>
+      <w:r>
+        <w:rPr>
+          <w:bCs/>
+        </w:rPr>
+        <w:t xml:space="preserve">Allows for leaves and nodes with multiple parents. </w:t>
+      </w:r>
+    </w:p>
+    <w:p>
+      <w:pPr>
+        <w:pStyle w:val="BodyTextIndent2"/>
+        <w:jc w:val="both"/>
+        <w:rPr>
+          <w:bCs/>
+        </w:rPr>
+      </w:pPr>
+      <w:r>
+        <w:rPr>
+          <w:bCs/>
+        </w:rPr>
+        <w:t xml:space="preserve">Statistical power </w:t>
+      </w:r>
+      <w:r>
+        <w:rPr>
+          <w:bCs/>
+        </w:rPr>
+        <w:t>estimation</w:t>
+      </w:r>
+      <w:r>
+        <w:rPr>
+          <w:bCs/>
+        </w:rPr>
+        <w:t xml:space="preserve"> for </w:t>
+      </w:r>
+      <w:r>
+        <w:rPr>
+          <w:bCs/>
+        </w:rPr>
+        <w:t xml:space="preserve">the </w:t>
+      </w:r>
+      <w:r>
+        <w:rPr>
+          <w:bCs/>
+        </w:rPr>
+        <w:t>conditional Bernoulli</w:t>
+      </w:r>
+      <w:r>
+        <w:rPr>
+          <w:bCs/>
+        </w:rPr>
+        <w:t xml:space="preserve"> model</w:t>
+      </w:r>
+      <w:r>
+        <w:rPr>
+          <w:bCs/>
+        </w:rPr>
+        <w:t>.</w:t>
+      </w:r>
+    </w:p>
+    <w:p>
+      <w:pPr>
+        <w:pStyle w:val="BodyTextIndent2"/>
+        <w:jc w:val="both"/>
+        <w:rPr>
+          <w:bCs/>
+        </w:rPr>
+      </w:pPr>
+      <w:r>
+        <w:rPr>
+          <w:bCs/>
+        </w:rPr>
+        <w:t xml:space="preserve">Statistical power </w:t>
+      </w:r>
+      <w:r>
+        <w:rPr>
+          <w:bCs/>
+        </w:rPr>
+        <w:t>estimation</w:t>
+      </w:r>
+      <w:r>
+        <w:rPr>
+          <w:bCs/>
+        </w:rPr>
+        <w:t xml:space="preserve"> for </w:t>
+      </w:r>
+      <w:r>
+        <w:rPr>
+          <w:bCs/>
+        </w:rPr>
+        <w:t xml:space="preserve">the </w:t>
+      </w:r>
+      <w:r>
+        <w:rPr>
+          <w:bCs/>
+        </w:rPr>
+        <w:t>tree-temporal scan</w:t>
+      </w:r>
+      <w:r>
+        <w:rPr>
+          <w:bCs/>
+        </w:rPr>
+        <w:t xml:space="preserve"> statistic.</w:t>
+      </w:r>
+    </w:p>
+    <w:p>
+      <w:pPr>
+        <w:pStyle w:val="BodyTextIndent2"/>
+        <w:jc w:val="both"/>
+        <w:rPr>
+          <w:bCs/>
+        </w:rPr>
+      </w:pPr>
+      <w:r>
+        <w:rPr>
+          <w:bCs/>
+        </w:rPr>
+        <w:t>Statistical power estimation for the purely temporal scan statistic.</w:t>
+      </w:r>
+    </w:p>
+    <w:p>
+      <w:pPr>
+        <w:pStyle w:val="BodyTextIndent2"/>
+        <w:jc w:val="both"/>
+        <w:rPr>
+          <w:bCs/>
+        </w:rPr>
+      </w:pPr>
+      <w:r>
+        <w:rPr>
+          <w:bCs/>
+        </w:rPr>
+        <w:t>Ability to restrict the scanning to only certain pre-specified levels of the tree.</w:t>
+      </w:r>
+    </w:p>
+    <w:p>
+      <w:pPr>
+        <w:pStyle w:val="BodyTextIndent2"/>
+        <w:jc w:val="both"/>
+        <w:rPr>
+          <w:bCs/>
+        </w:rPr>
+      </w:pPr>
+    </w:p>
+    <w:p>
+      <w:pPr>
+        <w:ind w:left="360" w:hanging="360"/>
+        <w:jc w:val="both"/>
+        <w:rPr>
+          <w:i/>
+        </w:rPr>
+      </w:pPr>
+      <w:r>
+        <w:rPr>
+          <w:i/>
+        </w:rPr>
+        <w:t>Minor Fixes</w:t>
+      </w:r>
+    </w:p>
+    <w:p>
+      <w:pPr>
+        <w:pStyle w:val="BodyTextIndent2"/>
+        <w:jc w:val="both"/>
+      </w:pPr>
+      <w:r>
+        <w:t>Correction in</w:t>
+      </w:r>
+      <w:r>
+        <w:t xml:space="preserve"> import wizard</w:t>
+      </w:r>
+      <w:r>
+        <w:t xml:space="preserve"> that causes memory leak when importing file</w:t>
+      </w:r>
+      <w:r>
+        <w:t>.</w:t>
+      </w:r>
+    </w:p>
+    <w:p>
+      <w:pPr>
+        <w:pStyle w:val="BodyTextIndent2"/>
+        <w:jc w:val="both"/>
+      </w:pPr>
+      <w:r>
+        <w:t>Correction to command-line override of randomization seed.</w:t>
+      </w:r>
+    </w:p>
+    <w:p>
+      <w:pPr>
+        <w:ind w:left="360" w:hanging="360"/>
+        <w:jc w:val="both"/>
+        <w:rPr>
+          <w:b/>
+        </w:rPr>
+      </w:pPr>
+    </w:p>
+    <w:p>
+      <w:pPr>
+        <w:ind w:left="360" w:hanging="360"/>
+        <w:jc w:val="both"/>
+        <w:rPr>
+          <w:b/>
+        </w:rPr>
+      </w:pPr>
+      <w:r>
+        <w:rPr>
+          <w:b/>
+        </w:rPr>
+        <w:t>Version 1.</w:t>
+      </w:r>
+      <w:r>
+        <w:rPr>
+          <w:b/>
+        </w:rPr>
+        <w:t>2</w:t>
+      </w:r>
+      <w:r>
+        <w:rPr>
+          <w:b/>
+        </w:rPr>
+        <w:t xml:space="preserve">, </w:t>
+      </w:r>
+      <w:r>
+        <w:rPr>
+          <w:b/>
+        </w:rPr>
+        <w:t>November</w:t>
+      </w:r>
+      <w:r>
+        <w:rPr>
+          <w:b/>
+        </w:rPr>
+        <w:t xml:space="preserve"> 20</w:t>
+      </w:r>
+      <w:r>
+        <w:rPr>
+          <w:b/>
+        </w:rPr>
+        <w:t>15</w:t>
+      </w:r>
+    </w:p>
+    <w:p>
+      <w:pPr>
+        <w:jc w:val="both"/>
+        <w:rPr>
+          <w:i/>
+        </w:rPr>
+      </w:pPr>
+      <w:r>
+        <w:rPr>
+          <w:i/>
+        </w:rPr>
+        <w:t>New Analytical Features</w:t>
+      </w:r>
+    </w:p>
+    <w:p>
+      <w:pPr>
+        <w:pStyle w:val="BodyTextIndent2"/>
+        <w:jc w:val="both"/>
+        <w:rPr>
+          <w:bCs/>
+        </w:rPr>
+      </w:pPr>
+      <w:r>
+        <w:rPr>
+          <w:bCs/>
+        </w:rPr>
+        <w:t>Tree-temporal scan statistic</w:t>
+      </w:r>
+      <w:r>
+        <w:rPr>
+          <w:bCs/>
+        </w:rPr>
+        <w:t>, conditioned on node and time</w:t>
+      </w:r>
+      <w:r>
+        <w:rPr>
+          <w:bCs/>
+        </w:rPr>
+        <w:t>, to adjust for overall temporal pattern</w:t>
+      </w:r>
+      <w:r>
+        <w:rPr>
+          <w:bCs/>
+        </w:rPr>
+        <w:t>.</w:t>
+      </w:r>
+    </w:p>
+    <w:p>
+      <w:pPr>
+        <w:pStyle w:val="BodyTextIndent2"/>
+        <w:jc w:val="both"/>
+        <w:rPr>
+          <w:bCs/>
+        </w:rPr>
+      </w:pPr>
+      <w:r>
+        <w:rPr>
+          <w:bCs/>
+        </w:rPr>
+        <w:t>Purely temporal scan statistic</w:t>
+      </w:r>
+      <w:r>
+        <w:rPr>
+          <w:bCs/>
+        </w:rPr>
+        <w:t>.</w:t>
+      </w:r>
+    </w:p>
+    <w:p>
+      <w:pPr>
+        <w:pStyle w:val="BodyTextIndent2"/>
+        <w:jc w:val="both"/>
+        <w:rPr>
+          <w:bCs/>
+        </w:rPr>
+      </w:pPr>
+      <w:r>
+        <w:rPr>
+          <w:bCs/>
+        </w:rPr>
+        <w:t>Adjustments for d</w:t>
+      </w:r>
+      <w:r>
+        <w:rPr>
+          <w:bCs/>
+        </w:rPr>
+        <w:t xml:space="preserve">ay of week </w:t>
+      </w:r>
+      <w:r>
+        <w:rPr>
+          <w:bCs/>
+        </w:rPr>
+        <w:t>and node-by-day of week interaction</w:t>
+      </w:r>
+      <w:r>
+        <w:rPr>
+          <w:bCs/>
+        </w:rPr>
+        <w:t>.</w:t>
+      </w:r>
+    </w:p>
+    <w:p>
+      <w:pPr>
+        <w:pStyle w:val="BodyTextIndent2"/>
+        <w:jc w:val="both"/>
+        <w:rPr>
+          <w:bCs/>
+        </w:rPr>
+      </w:pPr>
+      <w:r>
+        <w:rPr>
+          <w:bCs/>
+        </w:rPr>
+        <w:t xml:space="preserve">Calculation of </w:t>
+      </w:r>
+      <w:r>
+        <w:rPr>
+          <w:bCs/>
+        </w:rPr>
+        <w:t>attributable risk.</w:t>
+      </w:r>
+    </w:p>
+    <w:p>
+      <w:pPr>
+        <w:pStyle w:val="BodyTextIndent2"/>
+        <w:jc w:val="both"/>
+        <w:rPr>
+          <w:bCs/>
+        </w:rPr>
+      </w:pPr>
+    </w:p>
+    <w:p>
+      <w:pPr>
+        <w:ind w:left="360" w:hanging="360"/>
+        <w:jc w:val="both"/>
+        <w:rPr>
+          <w:i/>
+        </w:rPr>
+      </w:pPr>
+      <w:r>
+        <w:rPr>
+          <w:i/>
+        </w:rPr>
+        <w:t>Other Improvements</w:t>
+      </w:r>
+    </w:p>
+    <w:p>
+      <w:pPr>
+        <w:pStyle w:val="BodyTextIndent2"/>
+        <w:jc w:val="both"/>
+      </w:pPr>
+      <w:r>
+        <w:t>Improved import wizard.</w:t>
+      </w:r>
+    </w:p>
+    <w:p>
+      <w:pPr>
+        <w:pStyle w:val="BodyTextIndent2"/>
+        <w:jc w:val="both"/>
+      </w:pPr>
+      <w:r>
+        <w:t xml:space="preserve">New </w:t>
+      </w:r>
+      <w:r>
+        <w:t>example data sets.</w:t>
+      </w:r>
+    </w:p>
+    <w:p>
+      <w:pPr>
+        <w:pStyle w:val="BodyTextIndent2"/>
+        <w:jc w:val="both"/>
+      </w:pPr>
+      <w:r>
+        <w:t xml:space="preserve">Relative risk reported for all </w:t>
+      </w:r>
+      <w:r>
+        <w:t>scan type</w:t>
+      </w:r>
+      <w:r>
+        <w:t>s</w:t>
+      </w:r>
+      <w:r>
+        <w:t>, replacing o</w:t>
+      </w:r>
+      <w:r>
+        <w:t>bserved divided by expected.</w:t>
+      </w:r>
+    </w:p>
+    <w:p>
+      <w:pPr>
+        <w:pStyle w:val="BodyTextIndent2"/>
+        <w:jc w:val="both"/>
+      </w:pPr>
+      <w:r>
+        <w:t xml:space="preserve">Tree </w:t>
+      </w:r>
+      <w:r>
+        <w:t xml:space="preserve">structure </w:t>
+      </w:r>
+      <w:r>
+        <w:t xml:space="preserve">attributes reported in </w:t>
+      </w:r>
+      <w:r>
+        <w:t xml:space="preserve">the data </w:t>
+      </w:r>
+      <w:r>
+        <w:t>summary.</w:t>
+      </w:r>
+    </w:p>
+    <w:p>
+      <w:pPr>
+        <w:ind w:left="360" w:hanging="360"/>
+        <w:jc w:val="both"/>
+        <w:rPr>
+          <w:b/>
+        </w:rPr>
+      </w:pPr>
+    </w:p>
+    <w:p>
+      <w:pPr>
+        <w:ind w:left="360" w:hanging="360"/>
+        <w:jc w:val="both"/>
+        <w:rPr>
+          <w:b/>
+        </w:rPr>
+      </w:pPr>
+      <w:r>
+        <w:rPr>
+          <w:b/>
+        </w:rPr>
+        <w:t>Version 1.1.</w:t>
+      </w:r>
+      <w:r>
+        <w:rPr>
+          <w:b/>
+        </w:rPr>
+        <w:t>2</w:t>
+      </w:r>
+      <w:r>
+        <w:rPr>
+          <w:b/>
+        </w:rPr>
+        <w:t xml:space="preserve">, </w:t>
+      </w:r>
+      <w:r>
+        <w:rPr>
+          <w:b/>
+        </w:rPr>
+        <w:t>March</w:t>
+      </w:r>
+      <w:r>
+        <w:rPr>
+          <w:b/>
+        </w:rPr>
+        <w:t xml:space="preserve"> 2015</w:t>
+      </w:r>
+    </w:p>
+    <w:p>
+      <w:pPr>
+        <w:ind w:left="360" w:hanging="360"/>
+        <w:jc w:val="both"/>
+        <w:rPr>
+          <w:i/>
+        </w:rPr>
+      </w:pPr>
+      <w:r>
+        <w:rPr>
+          <w:i/>
+        </w:rPr>
+        <w:t>Minor Fixes</w:t>
+      </w:r>
+    </w:p>
+    <w:p>
+      <w:pPr>
+        <w:pStyle w:val="BodyTextIndent2"/>
+        <w:jc w:val="both"/>
+      </w:pPr>
+      <w:r>
+        <w:t>Correction to v1.1.1 random data generation for unconditional Poisson power estimation</w:t>
+      </w:r>
+      <w:r>
+        <w:t>.</w:t>
+      </w:r>
+    </w:p>
+    <w:p>
+      <w:pPr>
+        <w:ind w:left="360" w:hanging="360"/>
+        <w:jc w:val="both"/>
+        <w:rPr>
+          <w:b/>
+        </w:rPr>
+      </w:pPr>
+    </w:p>
+    <w:p>
+      <w:pPr>
+        <w:ind w:left="360" w:hanging="360"/>
+        <w:jc w:val="both"/>
+        <w:rPr>
+          <w:b/>
+        </w:rPr>
+      </w:pPr>
+      <w:r>
+        <w:rPr>
+          <w:b/>
+        </w:rPr>
+        <w:t xml:space="preserve">Version 1.1.1, </w:t>
+      </w:r>
+      <w:r>
+        <w:rPr>
+          <w:b/>
+        </w:rPr>
+        <w:t>March</w:t>
+      </w:r>
+      <w:r>
+        <w:rPr>
+          <w:b/>
+        </w:rPr>
+        <w:t xml:space="preserve"> 2015</w:t>
+      </w:r>
+    </w:p>
+    <w:p>
+      <w:pPr>
+        <w:jc w:val="both"/>
+        <w:rPr>
+          <w:i/>
+        </w:rPr>
+      </w:pPr>
+      <w:r>
+        <w:rPr>
+          <w:i/>
+        </w:rPr>
         <w:lastRenderedPageBreak/>
-        <w:t>Version 1.</w:t>
-      </w:r>
-      <w:r>
-        <w:rPr>
-          <w:b/>
-        </w:rPr>
-        <w:t>4</w:t>
+        <w:t>Improvements</w:t>
+      </w:r>
+    </w:p>
+    <w:p>
+      <w:pPr>
+        <w:pStyle w:val="PlainText"/>
+        <w:rPr>
+          <w:rFonts w:ascii="Times New Roman" w:hAnsi="Times New Roman"/>
+        </w:rPr>
+      </w:pPr>
+      <w:r>
+        <w:rPr>
+          <w:rFonts w:ascii="Times New Roman" w:hAnsi="Times New Roman"/>
+        </w:rPr>
+        <w:t>Statistical power estimates reported to a tabular file.</w:t>
+      </w:r>
+    </w:p>
+    <w:p>
+      <w:pPr>
+        <w:pStyle w:val="BodyTextIndent2"/>
+        <w:jc w:val="both"/>
+        <w:rPr>
+          <w:bCs/>
+        </w:rPr>
+      </w:pPr>
+    </w:p>
+    <w:p>
+      <w:pPr>
+        <w:ind w:left="360" w:hanging="360"/>
+        <w:jc w:val="both"/>
+        <w:rPr>
+          <w:i/>
+        </w:rPr>
+      </w:pPr>
+      <w:r>
+        <w:rPr>
+          <w:i/>
+        </w:rPr>
+        <w:t>Minor Fix</w:t>
+      </w:r>
+      <w:r>
+        <w:rPr>
+          <w:i/>
+        </w:rPr>
+        <w:t>es</w:t>
+      </w:r>
+    </w:p>
+    <w:p>
+      <w:pPr>
+        <w:pStyle w:val="BodyTextIndent2"/>
+        <w:jc w:val="both"/>
+      </w:pPr>
+      <w:r>
+        <w:t>Correction to log likelihood tie-breaking mechanism when calculating p-values.</w:t>
+      </w:r>
+    </w:p>
+    <w:p>
+      <w:pPr>
+        <w:pStyle w:val="BodyTextIndent2"/>
+        <w:jc w:val="both"/>
+      </w:pPr>
+      <w:r>
+        <w:t>Correction to random data generation for conditional Poisson power estimation</w:t>
+      </w:r>
+      <w:r>
+        <w:t>.</w:t>
+      </w:r>
+    </w:p>
+    <w:p>
+      <w:pPr>
+        <w:ind w:left="360" w:hanging="360"/>
+        <w:jc w:val="both"/>
+        <w:rPr>
+          <w:b/>
+        </w:rPr>
+      </w:pPr>
+    </w:p>
+    <w:p>
+      <w:pPr>
+        <w:ind w:left="360" w:hanging="360"/>
+        <w:jc w:val="both"/>
+        <w:rPr>
+          <w:b/>
+        </w:rPr>
+      </w:pPr>
+      <w:r>
+        <w:rPr>
+          <w:b/>
+        </w:rPr>
+        <w:t>Ve</w:t>
+      </w:r>
+      <w:r>
+        <w:rPr>
+          <w:b/>
+        </w:rPr>
+        <w:t xml:space="preserve">rsion </w:t>
+      </w:r>
+      <w:r>
+        <w:rPr>
+          <w:b/>
+        </w:rPr>
+        <w:t>1</w:t>
+      </w:r>
+      <w:r>
+        <w:rPr>
+          <w:b/>
+        </w:rPr>
+        <w:t>.</w:t>
+      </w:r>
+      <w:r>
+        <w:rPr>
+          <w:b/>
+        </w:rPr>
+        <w:t>1</w:t>
       </w:r>
       <w:r>
         <w:rPr>
@@ -2883,7 +3977,7 @@
         <w:rPr>
           <w:b/>
         </w:rPr>
-        <w:t>June</w:t>
+        <w:t>November</w:t>
       </w:r>
       <w:r>
         <w:rPr>
@@ -2895,973 +3989,6 @@
         <w:rPr>
           <w:b/>
         </w:rPr>
-        <w:t>18</w:t>
-      </w:r>
-    </w:p>
-    <w:p>
-      <w:pPr>
-        <w:jc w:val="both"/>
-        <w:rPr>
-          <w:i/>
-        </w:rPr>
-      </w:pPr>
-      <w:r>
-        <w:rPr>
-          <w:i/>
-        </w:rPr>
-        <w:t>New Analytical Features</w:t>
-      </w:r>
-    </w:p>
-    <w:p>
-      <w:pPr>
-        <w:pStyle w:val="BodyTextIndent2"/>
-        <w:jc w:val="both"/>
-        <w:rPr>
-          <w:bCs/>
-        </w:rPr>
-      </w:pPr>
-      <w:r>
-        <w:rPr>
-          <w:bCs/>
-        </w:rPr>
-        <w:t>Differential follow-up time</w:t>
-      </w:r>
-      <w:r>
-        <w:rPr>
-          <w:bCs/>
-        </w:rPr>
-        <w:t xml:space="preserve"> with temporal scan statistic</w:t>
-      </w:r>
-      <w:r>
-        <w:rPr>
-          <w:bCs/>
-        </w:rPr>
-        <w:t>s</w:t>
-      </w:r>
-      <w:r>
-        <w:rPr>
-          <w:bCs/>
-        </w:rPr>
-        <w:t>.</w:t>
-      </w:r>
-    </w:p>
-    <w:p>
-      <w:pPr>
-        <w:pStyle w:val="BodyTextIndent2"/>
-        <w:jc w:val="both"/>
-        <w:rPr>
-          <w:bCs/>
-        </w:rPr>
-      </w:pPr>
-      <w:r>
-        <w:rPr>
-          <w:bCs/>
-        </w:rPr>
-        <w:t>M</w:t>
-      </w:r>
-      <w:r>
-        <w:rPr>
-          <w:bCs/>
-        </w:rPr>
-        <w:t>ultiple ranges in the data time range</w:t>
-      </w:r>
-      <w:r>
-        <w:rPr>
-          <w:bCs/>
-        </w:rPr>
-        <w:t>.</w:t>
-      </w:r>
-    </w:p>
-    <w:p>
-      <w:pPr>
-        <w:pStyle w:val="BodyTextIndent2"/>
-        <w:jc w:val="both"/>
-        <w:rPr>
-          <w:bCs/>
-        </w:rPr>
-      </w:pPr>
-      <w:r>
-        <w:rPr>
-          <w:bCs/>
-        </w:rPr>
-        <w:t>S</w:t>
-      </w:r>
-      <w:r>
-        <w:rPr>
-          <w:bCs/>
-        </w:rPr>
-        <w:t>canning risk window parameters</w:t>
-      </w:r>
-      <w:r>
-        <w:rPr>
-          <w:bCs/>
-        </w:rPr>
-        <w:t>.</w:t>
-      </w:r>
-    </w:p>
-    <w:p>
-      <w:pPr>
-        <w:pStyle w:val="BodyTextIndent2"/>
-        <w:jc w:val="both"/>
-        <w:rPr>
-          <w:bCs/>
-        </w:rPr>
-      </w:pPr>
-      <w:r>
-        <w:rPr>
-          <w:bCs/>
-        </w:rPr>
-        <w:t>Tree visualization in html output file.</w:t>
-      </w:r>
-    </w:p>
-    <w:p>
-      <w:pPr>
-        <w:pStyle w:val="BodyTextIndent2"/>
-        <w:jc w:val="both"/>
-        <w:rPr>
-          <w:bCs/>
-        </w:rPr>
-      </w:pPr>
-    </w:p>
-    <w:p>
-      <w:pPr>
-        <w:ind w:left="360" w:hanging="360"/>
-        <w:jc w:val="both"/>
-        <w:rPr>
-          <w:i/>
-        </w:rPr>
-      </w:pPr>
-      <w:r>
-        <w:rPr>
-          <w:i/>
-        </w:rPr>
-        <w:t>Minor Fixes</w:t>
-      </w:r>
-    </w:p>
-    <w:p>
-      <w:pPr>
-        <w:ind w:left="360" w:hanging="360"/>
-        <w:jc w:val="both"/>
-        <w:rPr>
-          <w:color w:val="212121"/>
-        </w:rPr>
-      </w:pPr>
-      <w:r>
-        <w:rPr>
-          <w:color w:val="212121"/>
-        </w:rPr>
-        <w:t>Mac version updated to work with Oracle Java 9.</w:t>
-      </w:r>
-    </w:p>
-    <w:p>
-      <w:pPr>
-        <w:ind w:left="360" w:hanging="360"/>
-        <w:jc w:val="both"/>
-        <w:rPr>
-          <w:b/>
-        </w:rPr>
-      </w:pPr>
-    </w:p>
-    <w:p>
-      <w:pPr>
-        <w:ind w:left="360" w:hanging="360"/>
-        <w:jc w:val="both"/>
-        <w:rPr>
-          <w:b/>
-        </w:rPr>
-      </w:pPr>
-      <w:r>
-        <w:rPr>
-          <w:b/>
-        </w:rPr>
-        <w:t>Version 1.</w:t>
-      </w:r>
-      <w:r>
-        <w:rPr>
-          <w:b/>
-        </w:rPr>
-        <w:t>3</w:t>
-      </w:r>
-      <w:r>
-        <w:rPr>
-          <w:b/>
-        </w:rPr>
-        <w:t xml:space="preserve">, </w:t>
-      </w:r>
-      <w:r>
-        <w:rPr>
-          <w:b/>
-        </w:rPr>
-        <w:t>August</w:t>
-      </w:r>
-      <w:r>
-        <w:rPr>
-          <w:b/>
-        </w:rPr>
-        <w:t xml:space="preserve"> 20</w:t>
-      </w:r>
-      <w:r>
-        <w:rPr>
-          <w:b/>
-        </w:rPr>
-        <w:t>16</w:t>
-      </w:r>
-    </w:p>
-    <w:p>
-      <w:pPr>
-        <w:jc w:val="both"/>
-        <w:rPr>
-          <w:i/>
-        </w:rPr>
-      </w:pPr>
-      <w:r>
-        <w:rPr>
-          <w:i/>
-        </w:rPr>
-        <w:t>New Analytical Features</w:t>
-      </w:r>
-    </w:p>
-    <w:p>
-      <w:pPr>
-        <w:pStyle w:val="BodyTextIndent2"/>
-        <w:jc w:val="both"/>
-        <w:rPr>
-          <w:bCs/>
-        </w:rPr>
-      </w:pPr>
-      <w:r>
-        <w:rPr>
-          <w:bCs/>
-        </w:rPr>
-        <w:t>Scan multiple trees</w:t>
-      </w:r>
-      <w:r>
-        <w:rPr>
-          <w:bCs/>
-        </w:rPr>
-        <w:t xml:space="preserve"> simultaneously</w:t>
-      </w:r>
-      <w:r>
-        <w:rPr>
-          <w:bCs/>
-        </w:rPr>
-        <w:t>.</w:t>
-      </w:r>
-    </w:p>
-    <w:p>
-      <w:pPr>
-        <w:pStyle w:val="BodyTextIndent2"/>
-        <w:jc w:val="both"/>
-        <w:rPr>
-          <w:bCs/>
-        </w:rPr>
-      </w:pPr>
-      <w:r>
-        <w:rPr>
-          <w:bCs/>
-        </w:rPr>
-        <w:t xml:space="preserve">Allows for leaves and nodes with multiple parents. </w:t>
-      </w:r>
-    </w:p>
-    <w:p>
-      <w:pPr>
-        <w:pStyle w:val="BodyTextIndent2"/>
-        <w:jc w:val="both"/>
-        <w:rPr>
-          <w:bCs/>
-        </w:rPr>
-      </w:pPr>
-      <w:r>
-        <w:rPr>
-          <w:bCs/>
-        </w:rPr>
-        <w:t xml:space="preserve">Statistical power </w:t>
-      </w:r>
-      <w:r>
-        <w:rPr>
-          <w:bCs/>
-        </w:rPr>
-        <w:t>estimation</w:t>
-      </w:r>
-      <w:r>
-        <w:rPr>
-          <w:bCs/>
-        </w:rPr>
-        <w:t xml:space="preserve"> for </w:t>
-      </w:r>
-      <w:r>
-        <w:rPr>
-          <w:bCs/>
-        </w:rPr>
-        <w:t xml:space="preserve">the </w:t>
-      </w:r>
-      <w:r>
-        <w:rPr>
-          <w:bCs/>
-        </w:rPr>
-        <w:t>conditional Bernoulli</w:t>
-      </w:r>
-      <w:r>
-        <w:rPr>
-          <w:bCs/>
-        </w:rPr>
-        <w:t xml:space="preserve"> model</w:t>
-      </w:r>
-      <w:r>
-        <w:rPr>
-          <w:bCs/>
-        </w:rPr>
-        <w:t>.</w:t>
-      </w:r>
-    </w:p>
-    <w:p>
-      <w:pPr>
-        <w:pStyle w:val="BodyTextIndent2"/>
-        <w:jc w:val="both"/>
-        <w:rPr>
-          <w:bCs/>
-        </w:rPr>
-      </w:pPr>
-      <w:r>
-        <w:rPr>
-          <w:bCs/>
-        </w:rPr>
-        <w:t xml:space="preserve">Statistical power </w:t>
-      </w:r>
-      <w:r>
-        <w:rPr>
-          <w:bCs/>
-        </w:rPr>
-        <w:t>estimation</w:t>
-      </w:r>
-      <w:r>
-        <w:rPr>
-          <w:bCs/>
-        </w:rPr>
-        <w:t xml:space="preserve"> for </w:t>
-      </w:r>
-      <w:r>
-        <w:rPr>
-          <w:bCs/>
-        </w:rPr>
-        <w:t xml:space="preserve">the </w:t>
-      </w:r>
-      <w:r>
-        <w:rPr>
-          <w:bCs/>
-        </w:rPr>
-        <w:t>tree-temporal scan</w:t>
-      </w:r>
-      <w:r>
-        <w:rPr>
-          <w:bCs/>
-        </w:rPr>
-        <w:t xml:space="preserve"> statistic.</w:t>
-      </w:r>
-    </w:p>
-    <w:p>
-      <w:pPr>
-        <w:pStyle w:val="BodyTextIndent2"/>
-        <w:jc w:val="both"/>
-        <w:rPr>
-          <w:bCs/>
-        </w:rPr>
-      </w:pPr>
-      <w:r>
-        <w:rPr>
-          <w:bCs/>
-        </w:rPr>
-        <w:t>Statistical power estimation for the purely temporal scan statistic.</w:t>
-      </w:r>
-    </w:p>
-    <w:p>
-      <w:pPr>
-        <w:pStyle w:val="BodyTextIndent2"/>
-        <w:jc w:val="both"/>
-        <w:rPr>
-          <w:bCs/>
-        </w:rPr>
-      </w:pPr>
-      <w:r>
-        <w:rPr>
-          <w:bCs/>
-        </w:rPr>
-        <w:t>Ability to restrict the scanning to only certain pre-specified levels of the tree.</w:t>
-      </w:r>
-    </w:p>
-    <w:p>
-      <w:pPr>
-        <w:pStyle w:val="BodyTextIndent2"/>
-        <w:jc w:val="both"/>
-        <w:rPr>
-          <w:bCs/>
-        </w:rPr>
-      </w:pPr>
-    </w:p>
-    <w:p>
-      <w:pPr>
-        <w:ind w:left="360" w:hanging="360"/>
-        <w:jc w:val="both"/>
-        <w:rPr>
-          <w:i/>
-        </w:rPr>
-      </w:pPr>
-      <w:r>
-        <w:rPr>
-          <w:i/>
-        </w:rPr>
-        <w:t>Minor Fixes</w:t>
-      </w:r>
-    </w:p>
-    <w:p>
-      <w:pPr>
-        <w:pStyle w:val="BodyTextIndent2"/>
-        <w:jc w:val="both"/>
-      </w:pPr>
-      <w:r>
-        <w:t>Correction in</w:t>
-      </w:r>
-      <w:r>
-        <w:t xml:space="preserve"> import wizard</w:t>
-      </w:r>
-      <w:r>
-        <w:t xml:space="preserve"> that causes memory leak when importing file</w:t>
-      </w:r>
-      <w:r>
-        <w:t>.</w:t>
-      </w:r>
-    </w:p>
-    <w:p>
-      <w:pPr>
-        <w:pStyle w:val="BodyTextIndent2"/>
-        <w:jc w:val="both"/>
-      </w:pPr>
-      <w:r>
-        <w:t>Correction to command-line override of randomization seed.</w:t>
-      </w:r>
-    </w:p>
-    <w:p>
-      <w:pPr>
-        <w:ind w:left="360" w:hanging="360"/>
-        <w:jc w:val="both"/>
-        <w:rPr>
-          <w:b/>
-        </w:rPr>
-      </w:pPr>
-    </w:p>
-    <w:p>
-      <w:pPr>
-        <w:ind w:left="360" w:hanging="360"/>
-        <w:jc w:val="both"/>
-        <w:rPr>
-          <w:b/>
-        </w:rPr>
-      </w:pPr>
-      <w:r>
-        <w:rPr>
-          <w:b/>
-        </w:rPr>
-        <w:t>Version 1.</w:t>
-      </w:r>
-      <w:r>
-        <w:rPr>
-          <w:b/>
-        </w:rPr>
-        <w:t>2</w:t>
-      </w:r>
-      <w:r>
-        <w:rPr>
-          <w:b/>
-        </w:rPr>
-        <w:t xml:space="preserve">, </w:t>
-      </w:r>
-      <w:r>
-        <w:rPr>
-          <w:b/>
-        </w:rPr>
-        <w:t>November</w:t>
-      </w:r>
-      <w:r>
-        <w:rPr>
-          <w:b/>
-        </w:rPr>
-        <w:t xml:space="preserve"> 20</w:t>
-      </w:r>
-      <w:r>
-        <w:rPr>
-          <w:b/>
-        </w:rPr>
-        <w:t>15</w:t>
-      </w:r>
-    </w:p>
-    <w:p>
-      <w:pPr>
-        <w:jc w:val="both"/>
-        <w:rPr>
-          <w:i/>
-        </w:rPr>
-      </w:pPr>
-      <w:r>
-        <w:rPr>
-          <w:i/>
-        </w:rPr>
-        <w:t>New Analytical Features</w:t>
-      </w:r>
-    </w:p>
-    <w:p>
-      <w:pPr>
-        <w:pStyle w:val="BodyTextIndent2"/>
-        <w:jc w:val="both"/>
-        <w:rPr>
-          <w:bCs/>
-        </w:rPr>
-      </w:pPr>
-      <w:r>
-        <w:rPr>
-          <w:bCs/>
-        </w:rPr>
-        <w:t>Tree-temporal scan statistic</w:t>
-      </w:r>
-      <w:r>
-        <w:rPr>
-          <w:bCs/>
-        </w:rPr>
-        <w:t>, conditioned on node and time</w:t>
-      </w:r>
-      <w:r>
-        <w:rPr>
-          <w:bCs/>
-        </w:rPr>
-        <w:t>, to adjust for overall temporal pattern</w:t>
-      </w:r>
-      <w:r>
-        <w:rPr>
-          <w:bCs/>
-        </w:rPr>
-        <w:t>.</w:t>
-      </w:r>
-    </w:p>
-    <w:p>
-      <w:pPr>
-        <w:pStyle w:val="BodyTextIndent2"/>
-        <w:jc w:val="both"/>
-        <w:rPr>
-          <w:bCs/>
-        </w:rPr>
-      </w:pPr>
-      <w:r>
-        <w:rPr>
-          <w:bCs/>
-        </w:rPr>
-        <w:t>Purely temporal scan statistic</w:t>
-      </w:r>
-      <w:r>
-        <w:rPr>
-          <w:bCs/>
-        </w:rPr>
-        <w:t>.</w:t>
-      </w:r>
-    </w:p>
-    <w:p>
-      <w:pPr>
-        <w:pStyle w:val="BodyTextIndent2"/>
-        <w:jc w:val="both"/>
-        <w:rPr>
-          <w:bCs/>
-        </w:rPr>
-      </w:pPr>
-      <w:r>
-        <w:rPr>
-          <w:bCs/>
-        </w:rPr>
-        <w:t>Adjustments for d</w:t>
-      </w:r>
-      <w:r>
-        <w:rPr>
-          <w:bCs/>
-        </w:rPr>
-        <w:t xml:space="preserve">ay of week </w:t>
-      </w:r>
-      <w:r>
-        <w:rPr>
-          <w:bCs/>
-        </w:rPr>
-        <w:t>and node-by-day of week interaction</w:t>
-      </w:r>
-      <w:r>
-        <w:rPr>
-          <w:bCs/>
-        </w:rPr>
-        <w:t>.</w:t>
-      </w:r>
-    </w:p>
-    <w:p>
-      <w:pPr>
-        <w:pStyle w:val="BodyTextIndent2"/>
-        <w:jc w:val="both"/>
-        <w:rPr>
-          <w:bCs/>
-        </w:rPr>
-      </w:pPr>
-      <w:r>
-        <w:rPr>
-          <w:bCs/>
-        </w:rPr>
-        <w:t xml:space="preserve">Calculation of </w:t>
-      </w:r>
-      <w:r>
-        <w:rPr>
-          <w:bCs/>
-        </w:rPr>
-        <w:t>attributable risk.</w:t>
-      </w:r>
-    </w:p>
-    <w:p>
-      <w:pPr>
-        <w:pStyle w:val="BodyTextIndent2"/>
-        <w:jc w:val="both"/>
-        <w:rPr>
-          <w:bCs/>
-        </w:rPr>
-      </w:pPr>
-    </w:p>
-    <w:p>
-      <w:pPr>
-        <w:ind w:left="360" w:hanging="360"/>
-        <w:jc w:val="both"/>
-        <w:rPr>
-          <w:i/>
-        </w:rPr>
-      </w:pPr>
-      <w:r>
-        <w:rPr>
-          <w:i/>
-        </w:rPr>
-        <w:t>Other Improvements</w:t>
-      </w:r>
-    </w:p>
-    <w:p>
-      <w:pPr>
-        <w:pStyle w:val="BodyTextIndent2"/>
-        <w:jc w:val="both"/>
-      </w:pPr>
-      <w:r>
-        <w:t>Improved import wizard.</w:t>
-      </w:r>
-    </w:p>
-    <w:p>
-      <w:pPr>
-        <w:pStyle w:val="BodyTextIndent2"/>
-        <w:jc w:val="both"/>
-      </w:pPr>
-      <w:r>
-        <w:t xml:space="preserve">New </w:t>
-      </w:r>
-      <w:r>
-        <w:t>example data sets.</w:t>
-      </w:r>
-    </w:p>
-    <w:p>
-      <w:pPr>
-        <w:pStyle w:val="BodyTextIndent2"/>
-        <w:jc w:val="both"/>
-      </w:pPr>
-      <w:r>
-        <w:t xml:space="preserve">Relative risk reported for all </w:t>
-      </w:r>
-      <w:r>
-        <w:t>scan type</w:t>
-      </w:r>
-      <w:r>
-        <w:t>s</w:t>
-      </w:r>
-      <w:r>
-        <w:t>, replacing o</w:t>
-      </w:r>
-      <w:r>
-        <w:t>bserved divided by expected.</w:t>
-      </w:r>
-    </w:p>
-    <w:p>
-      <w:pPr>
-        <w:pStyle w:val="BodyTextIndent2"/>
-        <w:jc w:val="both"/>
-      </w:pPr>
-      <w:r>
-        <w:t xml:space="preserve">Tree </w:t>
-      </w:r>
-      <w:r>
-        <w:t xml:space="preserve">structure </w:t>
-      </w:r>
-      <w:r>
-        <w:t xml:space="preserve">attributes reported in </w:t>
-      </w:r>
-      <w:r>
-        <w:t xml:space="preserve">the data </w:t>
-      </w:r>
-      <w:r>
-        <w:t>summary.</w:t>
-      </w:r>
-    </w:p>
-    <w:p>
-      <w:pPr>
-        <w:ind w:left="360" w:hanging="360"/>
-        <w:jc w:val="both"/>
-        <w:rPr>
-          <w:b/>
-        </w:rPr>
-      </w:pPr>
-    </w:p>
-    <w:p>
-      <w:pPr>
-        <w:ind w:left="360" w:hanging="360"/>
-        <w:jc w:val="both"/>
-        <w:rPr>
-          <w:b/>
-        </w:rPr>
-      </w:pPr>
-      <w:r>
-        <w:rPr>
-          <w:b/>
-        </w:rPr>
-        <w:t>Version 1.1.</w:t>
-      </w:r>
-      <w:r>
-        <w:rPr>
-          <w:b/>
-        </w:rPr>
-        <w:t>2</w:t>
-      </w:r>
-      <w:r>
-        <w:rPr>
-          <w:b/>
-        </w:rPr>
-        <w:t xml:space="preserve">, </w:t>
-      </w:r>
-      <w:r>
-        <w:rPr>
-          <w:b/>
-        </w:rPr>
-        <w:t>March</w:t>
-      </w:r>
-      <w:r>
-        <w:rPr>
-          <w:b/>
-        </w:rPr>
-        <w:t xml:space="preserve"> 2015</w:t>
-      </w:r>
-    </w:p>
-    <w:p>
-      <w:pPr>
-        <w:ind w:left="360" w:hanging="360"/>
-        <w:jc w:val="both"/>
-        <w:rPr>
-          <w:i/>
-        </w:rPr>
-      </w:pPr>
-      <w:r>
-        <w:rPr>
-          <w:i/>
-        </w:rPr>
-        <w:t>Minor Fixes</w:t>
-      </w:r>
-    </w:p>
-    <w:p>
-      <w:pPr>
-        <w:pStyle w:val="BodyTextIndent2"/>
-        <w:jc w:val="both"/>
-      </w:pPr>
-      <w:r>
-        <w:t>Correction to v1.1.1 random data generation for unconditional Poisson power estimation</w:t>
-      </w:r>
-      <w:r>
-        <w:t>.</w:t>
-      </w:r>
-    </w:p>
-    <w:p>
-      <w:pPr>
-        <w:ind w:left="360" w:hanging="360"/>
-        <w:jc w:val="both"/>
-        <w:rPr>
-          <w:b/>
-        </w:rPr>
-      </w:pPr>
-    </w:p>
-    <w:p>
-      <w:pPr>
-        <w:ind w:left="360" w:hanging="360"/>
-        <w:jc w:val="both"/>
-        <w:rPr>
-          <w:b/>
-        </w:rPr>
-      </w:pPr>
-      <w:r>
-        <w:rPr>
-          <w:b/>
-        </w:rPr>
-        <w:t xml:space="preserve">Version 1.1.1, </w:t>
-      </w:r>
-      <w:r>
-        <w:rPr>
-          <w:b/>
-        </w:rPr>
-        <w:t>March</w:t>
-      </w:r>
-      <w:r>
-        <w:rPr>
-          <w:b/>
-        </w:rPr>
-        <w:t xml:space="preserve"> 2015</w:t>
-      </w:r>
-    </w:p>
-    <w:p>
-      <w:pPr>
-        <w:jc w:val="both"/>
-        <w:rPr>
-          <w:i/>
-        </w:rPr>
-      </w:pPr>
-      <w:r>
-        <w:rPr>
-          <w:i/>
-        </w:rPr>
-        <w:t>Improvements</w:t>
-      </w:r>
-    </w:p>
-    <w:p>
-      <w:pPr>
-        <w:pStyle w:val="PlainText"/>
-        <w:rPr>
-          <w:rFonts w:ascii="Times New Roman" w:hAnsi="Times New Roman"/>
-        </w:rPr>
-      </w:pPr>
-      <w:r>
-        <w:rPr>
-          <w:rFonts w:ascii="Times New Roman" w:hAnsi="Times New Roman"/>
-        </w:rPr>
-        <w:t>Statistical power estimates reported to a tabular file.</w:t>
-      </w:r>
-    </w:p>
-    <w:p>
-      <w:pPr>
-        <w:pStyle w:val="BodyTextIndent2"/>
-        <w:jc w:val="both"/>
-        <w:rPr>
-          <w:bCs/>
-        </w:rPr>
-      </w:pPr>
-    </w:p>
-    <w:p>
-      <w:pPr>
-        <w:ind w:left="360" w:hanging="360"/>
-        <w:jc w:val="both"/>
-        <w:rPr>
-          <w:i/>
-        </w:rPr>
-      </w:pPr>
-      <w:r>
-        <w:rPr>
-          <w:i/>
-        </w:rPr>
-        <w:t>Minor Fix</w:t>
-      </w:r>
-      <w:r>
-        <w:rPr>
-          <w:i/>
-        </w:rPr>
-        <w:t>es</w:t>
-      </w:r>
-    </w:p>
-    <w:p>
-      <w:pPr>
-        <w:pStyle w:val="BodyTextIndent2"/>
-        <w:jc w:val="both"/>
-      </w:pPr>
-      <w:r>
-        <w:t>Correction to log likelihood tie-breaking mechanism when calculating p-values.</w:t>
-      </w:r>
-    </w:p>
-    <w:p>
-      <w:pPr>
-        <w:pStyle w:val="BodyTextIndent2"/>
-        <w:jc w:val="both"/>
-      </w:pPr>
-      <w:r>
-        <w:t>Correction to random data generation for conditional Poisson power estimation</w:t>
-      </w:r>
-      <w:r>
-        <w:t>.</w:t>
-      </w:r>
-    </w:p>
-    <w:p>
-      <w:pPr>
-        <w:ind w:left="360" w:hanging="360"/>
-        <w:jc w:val="both"/>
-        <w:rPr>
-          <w:b/>
-        </w:rPr>
-      </w:pPr>
-    </w:p>
-    <w:p>
-      <w:pPr>
-        <w:ind w:left="360" w:hanging="360"/>
-        <w:jc w:val="both"/>
-        <w:rPr>
-          <w:b/>
-        </w:rPr>
-      </w:pPr>
-      <w:r>
-        <w:rPr>
-          <w:b/>
-        </w:rPr>
-        <w:t>Ve</w:t>
-      </w:r>
-      <w:r>
-        <w:rPr>
-          <w:b/>
-        </w:rPr>
-        <w:t xml:space="preserve">rsion </w:t>
-      </w:r>
-      <w:r>
-        <w:rPr>
-          <w:b/>
-        </w:rPr>
-        <w:t>1</w:t>
-      </w:r>
-      <w:r>
-        <w:rPr>
-          <w:b/>
-        </w:rPr>
-        <w:t>.</w:t>
-      </w:r>
-      <w:r>
-        <w:rPr>
-          <w:b/>
-        </w:rPr>
-        <w:t>1</w:t>
-      </w:r>
-      <w:r>
-        <w:rPr>
-          <w:b/>
-        </w:rPr>
-        <w:t xml:space="preserve">, </w:t>
-      </w:r>
-      <w:r>
-        <w:rPr>
-          <w:b/>
-        </w:rPr>
-        <w:t>November</w:t>
-      </w:r>
-      <w:r>
-        <w:rPr>
-          <w:b/>
-        </w:rPr>
-        <w:t xml:space="preserve"> 20</w:t>
-      </w:r>
-      <w:r>
-        <w:rPr>
-          <w:b/>
-        </w:rPr>
         <w:t>14</w:t>
       </w:r>
     </w:p>
@@ -3876,7 +4003,6 @@
         <w:rPr>
           <w:i/>
         </w:rPr>
-        <w:lastRenderedPageBreak/>
         <w:t>New Analytical Features</w:t>
       </w:r>
     </w:p>
@@ -4219,7 +4345,7 @@
 </file>
 
 <file path=word/numbering.xml><?xml version="1.0" encoding="utf-8"?>
-<w:numbering xmlns:wpc="http://schemas.microsoft.com/office/word/2010/wordprocessingCanvas" xmlns:cx="http://schemas.microsoft.com/office/drawing/2014/chartex" xmlns:cx1="http://schemas.microsoft.com/office/drawing/2015/9/8/chartex" xmlns:cx2="http://schemas.microsoft.com/office/drawing/2015/10/21/chartex" xmlns:cx3="http://schemas.microsoft.com/office/drawing/2016/5/9/chartex" xmlns:cx4="http://schemas.microsoft.com/office/drawing/2016/5/10/chartex" xmlns:cx5="http://schemas.microsoft.com/office/drawing/2016/5/11/chartex" xmlns:cx6="http://schemas.microsoft.com/office/drawing/2016/5/12/chartex" xmlns:cx7="http://schemas.microsoft.com/office/drawing/2016/5/13/chartex" xmlns:cx8="http://schemas.microsoft.com/office/drawing/2016/5/14/chartex" xmlns:mc="http://schemas.openxmlformats.org/markup-compatibility/2006" xmlns:aink="http://schemas.microsoft.com/office/drawing/2016/ink" xmlns:am3d="http://schemas.microsoft.com/office/drawing/2017/model3d" xmlns:o="urn:schemas-microsoft-com:office:office" xmlns:oel="http://schemas.microsoft.com/office/2019/extlst" xmlns:r="http://schemas.openxmlformats.org/officeDocument/2006/relationships" xmlns:m="http://schemas.openxmlformats.org/officeDocument/2006/math" xmlns:v="urn:schemas-microsoft-com:vml" xmlns:wp14="http://schemas.microsoft.com/office/word/2010/wordprocessingDrawing" xmlns:wp="http://schemas.openxmlformats.org/drawingml/2006/wordprocessingDrawing" xmlns:w10="urn:schemas-microsoft-com:office:word" xmlns:w="http://schemas.openxmlformats.org/wordprocessingml/2006/main" xmlns:w14="http://schemas.microsoft.com/office/word/2010/wordml" xmlns:w15="http://schemas.microsoft.com/office/word/2012/wordml" xmlns:w16cex="http://schemas.microsoft.com/office/word/2018/wordml/cex" xmlns:w16cid="http://schemas.microsoft.com/office/word/2016/wordml/cid" xmlns:w16="http://schemas.microsoft.com/office/word/2018/wordml" xmlns:w16du="http://schemas.microsoft.com/office/word/2023/wordml/word16du" xmlns:w16sdtdh="http://schemas.microsoft.com/office/word/2020/wordml/sdtdatahash" xmlns:w16sdtfl="http://schemas.microsoft.com/office/word/2024/wordml/sdtformatlock" xmlns:w16se="http://schemas.microsoft.com/office/word/2015/wordml/symex" xmlns:wpg="http://schemas.microsoft.com/office/word/2010/wordprocessingGroup" xmlns:wpi="http://schemas.microsoft.com/office/word/2010/wordprocessingInk" xmlns:wne="http://schemas.microsoft.com/office/word/2006/wordml" xmlns:wps="http://schemas.microsoft.com/office/word/2010/wordprocessingShape" mc:Ignorable="w14 w15 w16se w16cid w16 w16cex w16sdtdh w16sdtfl w16du wp14">
+<w:numbering xmlns:wpc="http://schemas.microsoft.com/office/word/2010/wordprocessingCanvas" xmlns:cx="http://schemas.microsoft.com/office/drawing/2014/chartex" xmlns:cx1="http://schemas.microsoft.com/office/drawing/2015/9/8/chartex" xmlns:cx2="http://schemas.microsoft.com/office/drawing/2015/10/21/chartex" xmlns:cx3="http://schemas.microsoft.com/office/drawing/2016/5/9/chartex" xmlns:cx4="http://schemas.microsoft.com/office/drawing/2016/5/10/chartex" xmlns:cx5="http://schemas.microsoft.com/office/drawing/2016/5/11/chartex" xmlns:cx6="http://schemas.microsoft.com/office/drawing/2016/5/12/chartex" xmlns:cx7="http://schemas.microsoft.com/office/drawing/2016/5/13/chartex" xmlns:cx8="http://schemas.microsoft.com/office/drawing/2016/5/14/chartex" xmlns:mc="http://schemas.openxmlformats.org/markup-compatibility/2006" xmlns:aink="http://schemas.microsoft.com/office/drawing/2016/ink" xmlns:am3d="http://schemas.microsoft.com/office/drawing/2017/model3d" xmlns:o="urn:schemas-microsoft-com:office:office" xmlns:oel="http://schemas.microsoft.com/office/2019/extlst" xmlns:r="http://schemas.openxmlformats.org/officeDocument/2006/relationships" xmlns:m="http://schemas.openxmlformats.org/officeDocument/2006/math" xmlns:v="urn:schemas-microsoft-com:vml" xmlns:wp14="http://schemas.microsoft.com/office/word/2010/wordprocessingDrawing" xmlns:wp="http://schemas.openxmlformats.org/drawingml/2006/wordprocessingDrawing" xmlns:w10="urn:schemas-microsoft-com:office:word" xmlns:w="http://schemas.openxmlformats.org/wordprocessingml/2006/main" xmlns:w14="http://schemas.microsoft.com/office/word/2010/wordml" xmlns:w15="http://schemas.microsoft.com/office/word/2012/wordml" xmlns:w16cei="http://schemas.microsoft.com/office/word/2026/wordml/cei" xmlns:w16cex="http://schemas.microsoft.com/office/word/2018/wordml/cex" xmlns:w16cid="http://schemas.microsoft.com/office/word/2016/wordml/cid" xmlns:w16="http://schemas.microsoft.com/office/word/2018/wordml" xmlns:w16du="http://schemas.microsoft.com/office/word/2023/wordml/word16du" xmlns:w16sdtdh="http://schemas.microsoft.com/office/word/2020/wordml/sdtdatahash" xmlns:w16sdtfl="http://schemas.microsoft.com/office/word/2024/wordml/sdtformatlock" xmlns:w16se="http://schemas.microsoft.com/office/word/2015/wordml/symex" xmlns:wpg="http://schemas.microsoft.com/office/word/2010/wordprocessingGroup" xmlns:wpi="http://schemas.microsoft.com/office/word/2010/wordprocessingInk" xmlns:wne="http://schemas.microsoft.com/office/word/2006/wordml" xmlns:wps="http://schemas.microsoft.com/office/word/2010/wordprocessingShape" mc:Ignorable="w14 w15 w16se w16cid w16 w16cex w16sdtdh w16sdtfl w16du wp14">
   <w:abstractNum w:abstractNumId="0" w15:restartNumberingAfterBreak="0">
     <w:nsid w:val="FFFFFF89"/>
     <w:multiLevelType w:val="singleLevel"/>

</xml_diff>

<commit_message>
* version history typo corrections
</commit_message>
<xml_diff>
--- a/documents/VersionHistory.docx
+++ b/documents/VersionHistory.docx
@@ -11,7 +11,6 @@
           <w:szCs w:val="32"/>
         </w:rPr>
       </w:pPr>
-      <w:proofErr w:type="spellStart"/>
       <w:r>
         <w:rPr>
           <w:b/>
@@ -34,16 +33,7 @@
           <w:sz w:val="32"/>
           <w:szCs w:val="32"/>
         </w:rPr>
-        <w:t>Scan</w:t>
-      </w:r>
-      <w:proofErr w:type="spellEnd"/>
-      <w:r>
-        <w:rPr>
-          <w:b/>
-          <w:sz w:val="32"/>
-          <w:szCs w:val="32"/>
-        </w:rPr>
-        <w:t xml:space="preserve"> Version History</w:t>
+        <w:t>Scan Version History</w:t>
       </w:r>
     </w:p>
     <w:p>
@@ -767,13 +757,7 @@
         <w:rPr>
           <w:b/>
         </w:rPr>
-        <w:t>2.4</w:t>
-      </w:r>
-      <w:r>
-        <w:rPr>
-          <w:b/>
-        </w:rPr>
-        <w:t>.1</w:t>
+        <w:t>2.4.1</w:t>
       </w:r>
       <w:r>
         <w:rPr>
@@ -812,6 +796,45 @@
         <w:rPr>
           <w:i/>
         </w:rPr>
+        <w:t>Improvements</w:t>
+      </w:r>
+    </w:p>
+    <w:p>
+      <w:pPr>
+        <w:pStyle w:val="BodyTextIndent2"/>
+        <w:jc w:val="both"/>
+      </w:pPr>
+      <w:r>
+        <w:t xml:space="preserve">Added an </w:t>
+      </w:r>
+      <w:r>
+        <w:t xml:space="preserve">alternative </w:t>
+      </w:r>
+      <w:r>
+        <w:t>option to skip evaluation of a tree node. Now specific nodes in the tree can be marked as not evaluated directly in the tree file.</w:t>
+      </w:r>
+    </w:p>
+    <w:p>
+      <w:pPr>
+        <w:ind w:left="360" w:hanging="360"/>
+        <w:jc w:val="both"/>
+        <w:rPr>
+          <w:i/>
+        </w:rPr>
+      </w:pPr>
+    </w:p>
+    <w:p>
+      <w:pPr>
+        <w:ind w:left="360" w:hanging="360"/>
+        <w:jc w:val="both"/>
+        <w:rPr>
+          <w:i/>
+        </w:rPr>
+      </w:pPr>
+      <w:r>
+        <w:rPr>
+          <w:i/>
+        </w:rPr>
         <w:t>Minor Fixes</w:t>
       </w:r>
     </w:p>
@@ -821,30 +844,6 @@
         <w:jc w:val="both"/>
       </w:pPr>
       <w:r>
-        <w:t xml:space="preserve">Added an </w:t>
-      </w:r>
-      <w:r>
-        <w:t xml:space="preserve">alternative </w:t>
-      </w:r>
-      <w:r>
-        <w:t>option to skip evaluation of a tree node</w:t>
-      </w:r>
-      <w:r>
-        <w:t xml:space="preserve">. Now specific nodes in the tree can be marked as not evaluated </w:t>
-      </w:r>
-      <w:r>
-        <w:t>directly in the tree file</w:t>
-      </w:r>
-      <w:r>
-        <w:t>.</w:t>
-      </w:r>
-    </w:p>
-    <w:p>
-      <w:pPr>
-        <w:pStyle w:val="BodyTextIndent2"/>
-        <w:jc w:val="both"/>
-      </w:pPr>
-      <w:r>
         <w:t>'Relative Risk' attribute renamed to 'Odds Ratio' for tree-time, conditioned on node and time</w:t>
       </w:r>
     </w:p>
@@ -854,16 +853,34 @@
         <w:jc w:val="both"/>
       </w:pPr>
       <w:r>
-        <w:t>Revised the formula for excess cases with tree-time, Conditioned on node and time.</w:t>
-      </w:r>
-    </w:p>
-    <w:p>
-      <w:pPr>
-        <w:pStyle w:val="BodyTextIndent2"/>
-        <w:jc w:val="both"/>
-      </w:pPr>
-      <w:r>
-        <w:t>Revised formula for Odds Ratio with tree-time, conditioned on node and time, adjusting for weekly trends nonparametrically.</w:t>
+        <w:t xml:space="preserve">Revised the formula for excess cases with tree-time, </w:t>
+      </w:r>
+      <w:r>
+        <w:t>c</w:t>
+      </w:r>
+      <w:r>
+        <w:t>onditioned on node and time.</w:t>
+      </w:r>
+    </w:p>
+    <w:p>
+      <w:pPr>
+        <w:pStyle w:val="BodyTextIndent2"/>
+        <w:jc w:val="both"/>
+      </w:pPr>
+      <w:r>
+        <w:t xml:space="preserve">Revised formula for </w:t>
+      </w:r>
+      <w:r>
+        <w:t>o</w:t>
+      </w:r>
+      <w:r>
+        <w:t xml:space="preserve">dds </w:t>
+      </w:r>
+      <w:r>
+        <w:t>r</w:t>
+      </w:r>
+      <w:r>
+        <w:t>atio with tree-time, conditioned on node and time, adjusting for weekly trends nonparametrically.</w:t>
       </w:r>
     </w:p>
     <w:p>
@@ -1089,6 +1106,7 @@
         <w:jc w:val="both"/>
       </w:pPr>
       <w:r>
+        <w:lastRenderedPageBreak/>
         <w:t>Recurrence intervals partly reported with words when greater than one thousand years</w:t>
       </w:r>
       <w:r>
@@ -1122,7 +1140,6 @@
         <w:jc w:val="both"/>
       </w:pPr>
       <w:r>
-        <w:lastRenderedPageBreak/>
         <w:t xml:space="preserve">Updated compilation to the </w:t>
       </w:r>
       <w:r>
@@ -1862,7 +1879,6 @@
         <w:rPr>
           <w:i/>
         </w:rPr>
-        <w:lastRenderedPageBreak/>
         <w:t>New Analytical Features</w:t>
       </w:r>
     </w:p>
@@ -2111,13 +2127,8 @@
       <w:r>
         <w:t xml:space="preserve">the </w:t>
       </w:r>
-      <w:proofErr w:type="spellStart"/>
-      <w:r>
-        <w:t>Newick</w:t>
-      </w:r>
-      <w:proofErr w:type="spellEnd"/>
-      <w:r>
-        <w:t xml:space="preserve"> tree </w:t>
+      <w:r>
+        <w:t xml:space="preserve">Newick tree </w:t>
       </w:r>
       <w:r>
         <w:t>in</w:t>
@@ -2870,6 +2881,7 @@
         <w:jc w:val="both"/>
       </w:pPr>
       <w:r>
+        <w:lastRenderedPageBreak/>
         <w:t>Added option to input control file separately from count file.</w:t>
       </w:r>
     </w:p>
@@ -2888,7 +2900,6 @@
         <w:jc w:val="both"/>
       </w:pPr>
       <w:r>
-        <w:lastRenderedPageBreak/>
         <w:t>Added ‘Parent Node’ column to results files.</w:t>
       </w:r>
     </w:p>
@@ -3851,7 +3862,6 @@
         <w:rPr>
           <w:i/>
         </w:rPr>
-        <w:lastRenderedPageBreak/>
         <w:t>Improvements</w:t>
       </w:r>
     </w:p>
@@ -4140,30 +4150,17 @@
         <w:pStyle w:val="BodyTextIndent2"/>
         <w:jc w:val="both"/>
       </w:pPr>
-      <w:proofErr w:type="spellStart"/>
-      <w:r>
-        <w:t>TreeScan</w:t>
-      </w:r>
-      <w:proofErr w:type="spellEnd"/>
-      <w:r>
-        <w:t xml:space="preserve"> user guide in .pdf format</w:t>
-      </w:r>
-    </w:p>
-    <w:p>
-      <w:pPr>
-        <w:pStyle w:val="BodyTextIndent2"/>
-        <w:jc w:val="both"/>
-      </w:pPr>
-      <w:r>
-        <w:t xml:space="preserve">New </w:t>
-      </w:r>
-      <w:proofErr w:type="spellStart"/>
-      <w:r>
-        <w:t>TreeScan</w:t>
-      </w:r>
-      <w:proofErr w:type="spellEnd"/>
-      <w:r>
-        <w:t xml:space="preserve"> logo and icon</w:t>
+      <w:r>
+        <w:t>TreeScan user guide in .pdf format</w:t>
+      </w:r>
+    </w:p>
+    <w:p>
+      <w:pPr>
+        <w:pStyle w:val="BodyTextIndent2"/>
+        <w:jc w:val="both"/>
+      </w:pPr>
+      <w:r>
+        <w:t>New TreeScan logo and icon</w:t>
       </w:r>
     </w:p>
     <w:p>

</xml_diff>